<commit_message>
docs: add backend sheet links and confirmed details to HMSI/HD SOP
- Link each brand to its dashboard backend Google Sheet
- Point Step 3 at the shared MS Source LT-wise (Lead level) report
- Note that the client shares unique leads only, so no duplicity check

Co-Authored-By: Claude Opus 5.5 <noreply@anthropic.com>
Claude-Session: https://claude.ai/code/session_01Dqt8WaaW3ARVbpuguri7t5
</commit_message>
<xml_diff>
--- a/docs/SOP_HMSI_HD_Lead_Booking_Process.docx
+++ b/docs/SOP_HMSI_HD_Lead_Booking_Process.docx
@@ -45,7 +45,7 @@
         <w:t xml:space="preserve">Harley Davidson</w:t>
       </w:r>
       <w:r>
-        <w:t xml:space="preserve">. These brands have no Lead Duplicity Report: the lead dump is received from the client by email. After the mobile numbers are encrypted and LT, Source and UTM are mapped, the process is the same as for Royal Enfield.</w:t>
+        <w:t xml:space="preserve">. These brands have no Lead Duplicity Report: the lead dump is received from the client by email. After the mobile numbers are encrypted and LT, Source and UTM are mapped, the process is the same as for Royal Enfield. The client shares unique leads only, so no Unique/Duplicate check is needed.</w:t>
       </w:r>
     </w:p>
     <w:tbl>
@@ -65,10 +65,9 @@
         </w:tblCellMar>
       </w:tblPr>
       <w:tblGrid>
-        <w:gridCol w:w="1900"/>
-        <w:gridCol w:w="1500"/>
-        <w:gridCol w:w="2980"/>
-        <w:gridCol w:w="2980"/>
+        <w:gridCol w:w="2200"/>
+        <w:gridCol w:w="1800"/>
+        <w:gridCol w:w="5360"/>
       </w:tblGrid>
       <w:tr>
         <w:trPr>
@@ -76,7 +75,7 @@
         </w:trPr>
         <w:tc>
           <w:tcPr>
-            <w:tcW w:w="1900" w:type="dxa"/>
+            <w:tcW w:w="2200" w:type="dxa"/>
             <w:shd w:val="clear" w:color="auto" w:fill="0F4761"/>
           </w:tcPr>
           <w:p>
@@ -95,7 +94,7 @@
         </w:tc>
         <w:tc>
           <w:tcPr>
-            <w:tcW w:w="1500" w:type="dxa"/>
+            <w:tcW w:w="1800" w:type="dxa"/>
             <w:shd w:val="clear" w:color="auto" w:fill="0F4761"/>
           </w:tcPr>
           <w:p>
@@ -114,26 +113,7 @@
         </w:tc>
         <w:tc>
           <w:tcPr>
-            <w:tcW w:w="2980" w:type="dxa"/>
-            <w:shd w:val="clear" w:color="auto" w:fill="0F4761"/>
-          </w:tcPr>
-          <w:p>
-            <w:pPr>
-              <w:spacing w:before="40" w:after="40"/>
-            </w:pPr>
-            <w:r>
-              <w:rPr>
-                <w:b/>
-                <w:bCs/>
-                <w:color w:val="FFFFFF"/>
-              </w:rPr>
-              <w:t xml:space="preserve">MS Source LT-wise report</w:t>
-            </w:r>
-          </w:p>
-        </w:tc>
-        <w:tc>
-          <w:tcPr>
-            <w:tcW w:w="2980" w:type="dxa"/>
+            <w:tcW w:w="5360" w:type="dxa"/>
             <w:shd w:val="clear" w:color="auto" w:fill="0F4761"/>
           </w:tcPr>
           <w:p>
@@ -154,7 +134,7 @@
       <w:tr>
         <w:tc>
           <w:tcPr>
-            <w:tcW w:w="1900" w:type="dxa"/>
+            <w:tcW w:w="2200" w:type="dxa"/>
           </w:tcPr>
           <w:p>
             <w:pPr>
@@ -167,7 +147,7 @@
         </w:tc>
         <w:tc>
           <w:tcPr>
-            <w:tcW w:w="1500" w:type="dxa"/>
+            <w:tcW w:w="1800" w:type="dxa"/>
           </w:tcPr>
           <w:p>
             <w:pPr>
@@ -185,35 +165,28 @@
         </w:tc>
         <w:tc>
           <w:tcPr>
-            <w:tcW w:w="2980" w:type="dxa"/>
+            <w:tcW w:w="5360" w:type="dxa"/>
           </w:tcPr>
           <w:p>
             <w:pPr>
               <w:spacing w:before="40" w:after="40"/>
             </w:pPr>
-            <w:r>
-              <w:t xml:space="preserve">&lt;add link&gt;</w:t>
-            </w:r>
-          </w:p>
-        </w:tc>
-        <w:tc>
-          <w:tcPr>
-            <w:tcW w:w="2980" w:type="dxa"/>
-          </w:tcPr>
-          <w:p>
-            <w:pPr>
-              <w:spacing w:before="40" w:after="40"/>
-            </w:pPr>
-            <w:r>
-              <w:t xml:space="preserve">&lt;add link&gt;</w:t>
-            </w:r>
+            <w:hyperlink r:id="rIdLink1" w:history="1">
+              <w:r>
+                <w:rPr>
+                  <w:color w:val="0563C1"/>
+                  <w:u w:val="single"/>
+                </w:rPr>
+                <w:t xml:space="preserve">HMSI Redwing dashboard backend</w:t>
+              </w:r>
+            </w:hyperlink>
           </w:p>
         </w:tc>
       </w:tr>
       <w:tr>
         <w:tc>
           <w:tcPr>
-            <w:tcW w:w="1900" w:type="dxa"/>
+            <w:tcW w:w="2200" w:type="dxa"/>
           </w:tcPr>
           <w:p>
             <w:pPr>
@@ -226,7 +199,7 @@
         </w:tc>
         <w:tc>
           <w:tcPr>
-            <w:tcW w:w="1500" w:type="dxa"/>
+            <w:tcW w:w="1800" w:type="dxa"/>
           </w:tcPr>
           <w:p>
             <w:pPr>
@@ -244,35 +217,28 @@
         </w:tc>
         <w:tc>
           <w:tcPr>
-            <w:tcW w:w="2980" w:type="dxa"/>
+            <w:tcW w:w="5360" w:type="dxa"/>
           </w:tcPr>
           <w:p>
             <w:pPr>
               <w:spacing w:before="40" w:after="40"/>
             </w:pPr>
-            <w:r>
-              <w:t xml:space="preserve">&lt;add link&gt;</w:t>
-            </w:r>
-          </w:p>
-        </w:tc>
-        <w:tc>
-          <w:tcPr>
-            <w:tcW w:w="2980" w:type="dxa"/>
-          </w:tcPr>
-          <w:p>
-            <w:pPr>
-              <w:spacing w:before="40" w:after="40"/>
-            </w:pPr>
-            <w:r>
-              <w:t xml:space="preserve">&lt;add link&gt;</w:t>
-            </w:r>
+            <w:hyperlink r:id="rIdLink2" w:history="1">
+              <w:r>
+                <w:rPr>
+                  <w:color w:val="0563C1"/>
+                  <w:u w:val="single"/>
+                </w:rPr>
+                <w:t xml:space="preserve">HMSI Bigwing dashboard backend</w:t>
+              </w:r>
+            </w:hyperlink>
           </w:p>
         </w:tc>
       </w:tr>
       <w:tr>
         <w:tc>
           <w:tcPr>
-            <w:tcW w:w="1900" w:type="dxa"/>
+            <w:tcW w:w="2200" w:type="dxa"/>
           </w:tcPr>
           <w:p>
             <w:pPr>
@@ -285,7 +251,7 @@
         </w:tc>
         <w:tc>
           <w:tcPr>
-            <w:tcW w:w="1500" w:type="dxa"/>
+            <w:tcW w:w="1800" w:type="dxa"/>
           </w:tcPr>
           <w:p>
             <w:pPr>
@@ -303,28 +269,21 @@
         </w:tc>
         <w:tc>
           <w:tcPr>
-            <w:tcW w:w="2980" w:type="dxa"/>
+            <w:tcW w:w="5360" w:type="dxa"/>
           </w:tcPr>
           <w:p>
             <w:pPr>
               <w:spacing w:before="40" w:after="40"/>
             </w:pPr>
-            <w:r>
-              <w:t xml:space="preserve">&lt;add link&gt;</w:t>
-            </w:r>
-          </w:p>
-        </w:tc>
-        <w:tc>
-          <w:tcPr>
-            <w:tcW w:w="2980" w:type="dxa"/>
-          </w:tcPr>
-          <w:p>
-            <w:pPr>
-              <w:spacing w:before="40" w:after="40"/>
-            </w:pPr>
-            <w:r>
-              <w:t xml:space="preserve">&lt;add link&gt;</w:t>
-            </w:r>
+            <w:hyperlink r:id="rIdLink3" w:history="1">
+              <w:r>
+                <w:rPr>
+                  <w:color w:val="0563C1"/>
+                  <w:u w:val="single"/>
+                </w:rPr>
+                <w:t xml:space="preserve">H-D X-440 Dashboard Backend</w:t>
+              </w:r>
+            </w:hyperlink>
           </w:p>
         </w:tc>
       </w:tr>
@@ -580,7 +539,7 @@
         <w:contextualSpacing w:val="0"/>
       </w:pPr>
       <w:r>
-        <w:t xml:space="preserve">Open the brand's </w:t>
+        <w:t xml:space="preserve">Open the </w:t>
       </w:r>
       <w:r>
         <w:rPr>
@@ -590,7 +549,7 @@
         <w:t xml:space="preserve">MS Source LT-wise (Lead level) report</w:t>
       </w:r>
       <w:r>
-        <w:t xml:space="preserve"> from the LD data. The link for each brand is in the table above.</w:t>
+        <w:t xml:space="preserve"> from the LD data and filter it to the brand you are processing. https://docs.google.com/spreadsheets/d/1oXbKagFoARtnHtFVHikHk79buMp3VY_u1tqlvt6U9dc/edit?gid=1139966500#gid=1139966500</w:t>
       </w:r>
     </w:p>
     <w:p>
@@ -1177,7 +1136,7 @@
         <w:t xml:space="preserve">backend Google Sheet</w:t>
       </w:r>
       <w:r>
-        <w:t xml:space="preserve"> and import the data that feeds the dashboard. Do not rename the sheet or its tab.</w:t>
+        <w:t xml:space="preserve"> (see the table at the top) and import the data that feeds the dashboard. Do not rename the sheet or its tab.</w:t>
       </w:r>
     </w:p>
     <w:sectPr>

</xml_diff>